<commit_message>
release: v1.0.1（固定名 APK + latest.json + 下载页）
</commit_message>
<xml_diff>
--- a/docs/安静陪伴-使用说明.docx
+++ b/docs/安静陪伴-使用说明.docx
@@ -872,6 +872,111 @@
           <w:sz w:val="21"/>
         </w:rPr>
         <w:t>Render 免费版闲置 15 分钟会休眠，冷启动 30–60 秒。但**电脑关机不影响它** —— 服务器在云上。</w:t>
+      </w:r>
+    </w:p>
+    <w:p>
+      <w:pPr>
+        <w:spacing w:before="240" w:after="80"/>
+      </w:pPr>
+      <w:r>
+        <w:rPr>
+          <w:rFonts w:ascii="微软雅黑" w:hAnsi="微软雅黑" w:eastAsia="微软雅黑"/>
+          <w:b/>
+          <w:color w:val="4F6B65"/>
+          <w:sz w:val="25"/>
+        </w:rPr>
+        <w:t>以后有新版，怎么在手机上拿到</w:t>
+      </w:r>
+    </w:p>
+    <w:p>
+      <w:pPr>
+        <w:spacing w:after="60" w:line="348" w:lineRule="auto"/>
+        <w:ind w:left="624" w:hanging="283"/>
+      </w:pPr>
+      <w:r>
+        <w:rPr>
+          <w:rFonts w:ascii="微软雅黑" w:hAnsi="微软雅黑" w:eastAsia="微软雅黑"/>
+          <w:sz w:val="21"/>
+        </w:rPr>
+        <w:t>· **扫一次就够，以后不用再扫。** 桌面上的「扫码下载APK.png」指向一个固定地址，每次发新版都覆盖同一个文件，所以它永远是最新版。</w:t>
+      </w:r>
+    </w:p>
+    <w:p>
+      <w:pPr>
+        <w:spacing w:after="60" w:line="348" w:lineRule="auto"/>
+        <w:ind w:left="624" w:hanging="283"/>
+      </w:pPr>
+      <w:r>
+        <w:rPr>
+          <w:rFonts w:ascii="微软雅黑" w:hAnsi="微软雅黑" w:eastAsia="微软雅黑"/>
+          <w:sz w:val="21"/>
+        </w:rPr>
+        <w:t>· 已经装好的 App 也会自己发现更新：顶部会出现一条「有新版 vX.X.X · 下载新版」，点一下就下载新安装包。</w:t>
+      </w:r>
+    </w:p>
+    <w:p>
+      <w:pPr>
+        <w:spacing w:after="60" w:line="348" w:lineRule="auto"/>
+        <w:ind w:left="624" w:hanging="283"/>
+      </w:pPr>
+      <w:r>
+        <w:rPr>
+          <w:rFonts w:ascii="微软雅黑" w:hAnsi="微软雅黑" w:eastAsia="微软雅黑"/>
+          <w:sz w:val="21"/>
+        </w:rPr>
+        <w:t>· 下载地址（永久有效，不用记）：</w:t>
+      </w:r>
+    </w:p>
+    <w:p>
+      <w:pPr>
+        <w:spacing w:before="0" w:after="120" w:line="360" w:lineRule="auto"/>
+      </w:pPr>
+      <w:r>
+        <w:rPr>
+          <w:rFonts w:ascii="微软雅黑" w:hAnsi="微软雅黑" w:eastAsia="微软雅黑"/>
+          <w:b w:val="0"/>
+          <w:sz w:val="18"/>
+        </w:rPr>
+        <w:t>https://raw.githubusercontent.com/GONE-ZR/aura-companion/main/downloads/aura-companion.apk</w:t>
+      </w:r>
+    </w:p>
+    <w:p>
+      <w:pPr>
+        <w:spacing w:after="60" w:line="348" w:lineRule="auto"/>
+        <w:ind w:left="624" w:hanging="283"/>
+      </w:pPr>
+      <w:r>
+        <w:rPr>
+          <w:rFonts w:ascii="微软雅黑" w:hAnsi="微软雅黑" w:eastAsia="微软雅黑"/>
+          <w:sz w:val="21"/>
+        </w:rPr>
+        <w:t>· 版本清单（App 就是读它来判断有没有新版）：</w:t>
+      </w:r>
+    </w:p>
+    <w:p>
+      <w:pPr>
+        <w:spacing w:before="0" w:after="120" w:line="360" w:lineRule="auto"/>
+      </w:pPr>
+      <w:r>
+        <w:rPr>
+          <w:rFonts w:ascii="微软雅黑" w:hAnsi="微软雅黑" w:eastAsia="微软雅黑"/>
+          <w:b w:val="0"/>
+          <w:sz w:val="18"/>
+        </w:rPr>
+        <w:t>https://raw.githubusercontent.com/GONE-ZR/aura-companion/main/downloads/latest.json</w:t>
+      </w:r>
+    </w:p>
+    <w:p>
+      <w:pPr>
+        <w:spacing w:after="60" w:line="348" w:lineRule="auto"/>
+        <w:ind w:left="624" w:hanging="283"/>
+      </w:pPr>
+      <w:r>
+        <w:rPr>
+          <w:rFonts w:ascii="微软雅黑" w:hAnsi="微软雅黑" w:eastAsia="微软雅黑"/>
+          <w:sz w:val="21"/>
+        </w:rPr>
+        <w:t>· 换手机 / 重装系统，扫这张码就能重新下。</w:t>
       </w:r>
     </w:p>
     <w:p>

</xml_diff>